<commit_message>
feat: contract date confirm, structured requisites, contacts table
</commit_message>
<xml_diff>
--- a/templates/marked.docx
+++ b/templates/marked.docx
@@ -4978,6 +4978,7 @@
               <w:rPr>
                 <w:rtl w:val="0"/>
               </w:rPr>
+              <w:t xml:space="preserve">hello@rassvet.digital</w:t>
             </w:r>
           </w:p>
         </w:tc>
@@ -5063,6 +5064,7 @@
               <w:rPr>
                 <w:rtl w:val="0"/>
               </w:rPr>
+              <w:t xml:space="preserve">{executorEmail}</w:t>
             </w:r>
           </w:p>
         </w:tc>
@@ -5081,6 +5083,7 @@
               <w:rPr>
                 <w:rtl w:val="0"/>
               </w:rPr>
+              <w:t xml:space="preserve">{executorMessenger}</w:t>
             </w:r>
           </w:p>
         </w:tc>
@@ -5099,6 +5102,7 @@
               <w:rPr>
                 <w:rtl w:val="0"/>
               </w:rPr>
+              <w:t xml:space="preserve">{executorPhone}</w:t>
             </w:r>
           </w:p>
         </w:tc>

</xml_diff>

<commit_message>
feat: executor signature blocks in section 14 and appendix
</commit_message>
<xml_diff>
--- a/templates/marked.docx
+++ b/templates/marked.docx
@@ -3690,6 +3690,50 @@
                 <w:rtl w:val="0"/>
               </w:rPr>
               <w:br w:type="textWrapping"/>
+            </w:r>
+          </w:p>
+          <w:p>
+            <w:r>
+              <w:rPr>
+                <w:rFonts w:ascii="Helvetica Neue" w:cs="Helvetica Neue" w:eastAsia="Helvetica Neue" w:hAnsi="Helvetica Neue"/>
+                <w:sz w:val="22"/>
+                <w:szCs w:val="22"/>
+                <w:rtl w:val="0"/>
+              </w:rPr>
+              <w:t xml:space="preserve">{executorRole}</w:t>
+            </w:r>
+          </w:p>
+          <w:p>
+            <w:r>
+              <w:rPr>
+                <w:rFonts w:ascii="Helvetica Neue" w:cs="Helvetica Neue" w:eastAsia="Helvetica Neue" w:hAnsi="Helvetica Neue"/>
+                <w:sz w:val="22"/>
+                <w:szCs w:val="22"/>
+                <w:rtl w:val="0"/>
+              </w:rPr>
+              <w:t xml:space="preserve">{executorNameOnly}</w:t>
+            </w:r>
+          </w:p>
+          <w:p>
+            <w:r>
+              <w:rPr>
+                <w:rFonts w:ascii="Helvetica Neue" w:cs="Helvetica Neue" w:eastAsia="Helvetica Neue" w:hAnsi="Helvetica Neue"/>
+                <w:sz w:val="22"/>
+                <w:szCs w:val="22"/>
+                <w:rtl w:val="0"/>
+              </w:rPr>
+              <w:t xml:space="preserve">_________________ {executorShort}</w:t>
+            </w:r>
+          </w:p>
+          <w:p>
+            <w:r>
+              <w:rPr>
+                <w:rFonts w:ascii="Helvetica Neue" w:cs="Helvetica Neue" w:eastAsia="Helvetica Neue" w:hAnsi="Helvetica Neue"/>
+                <w:sz w:val="22"/>
+                <w:szCs w:val="22"/>
+                <w:rtl w:val="0"/>
+              </w:rPr>
+              <w:t xml:space="preserve">м.п.</w:t>
             </w:r>
           </w:p>
           <w:p>
@@ -6341,6 +6385,17 @@
                 <w:rtl w:val="0"/>
               </w:rPr>
               <w:t xml:space="preserve">От Исполнителя</w:t>
+            </w:r>
+          </w:p>
+          <w:p>
+            <w:r>
+              <w:rPr>
+                <w:rFonts w:ascii="Helvetica Neue" w:cs="Helvetica Neue" w:eastAsia="Helvetica Neue" w:hAnsi="Helvetica Neue"/>
+                <w:sz w:val="22"/>
+                <w:szCs w:val="22"/>
+                <w:rtl w:val="0"/>
+              </w:rPr>
+              <w:t xml:space="preserve">{executorRole}</w:t>
             </w:r>
           </w:p>
           <w:p>

</xml_diff>